<commit_message>
al ejecturar run_pipeline.py lee nuevos documentos incorporados a datos_engira/08_MEMORIA_ECONOMICA, los relaciona en relacion_gastos y los incorpora a outputs/05_modelos_normalizados/memoria_economica.xlsx
</commit_message>
<xml_diff>
--- a/engine/outputs/05_modelos_normalizados/memoria_de_actividades.docx
+++ b/engine/outputs/05_modelos_normalizados/memoria_de_actividades.docx
@@ -2838,161 +2838,219 @@
               <w:br/>
               <w:t xml:space="preserve">  Evidencia (automatico, 100%): 05_PARTICIPANTES_Y_COLABORADORES/FUNCIONES DEL PUESTO.docx</w:t>
               <w:br/>
+              <w:t xml:space="preserve">  Evidencia (automatico, 78%): 08_JUSTIFICACION_ECONOMICA/CONTABILIDAD/Moviments_1_9_2026.xlsx</w:t>
+              <w:br/>
               <w:t xml:space="preserve">  Evidencia (automatico, 78%): 08_JUSTIFICACION_ECONOMICA/CONTABILIDAD/INGRESOS/engira_09_la_pera_del_olmo.pdf</w:t>
               <w:br/>
               <w:t xml:space="preserve">  Evidencia (automatico, 78%): 08_JUSTIFICACION_ECONOMICA/CONTABILIDAD/INGRESOS/01_di_art_engira.pdf</w:t>
               <w:br/>
-              <w:t xml:space="preserve">  Evidencia (automatico, 78%): 08_JUSTIFICACION_ECONOMICA/CONTABILIDAD/GASTOS/1TR2026/ALIANZAS /F260009 -Zeena - Dossier EnGira.pdf</w:t>
-              <w:br/>
-              <w:t xml:space="preserve">  Evidencia (automatico, 78%): 08_JUSTIFICACION_ECONOMICA/CONTABILIDAD/GASTOS/1TR2026/SERVICIO DATA/factura_1_servicio_data.pdf</w:t>
-              <w:br/>
-              <w:t xml:space="preserve">  Evidencia (automatico, 78%): 08_JUSTIFICACION_ECONOMICA/CONTABILIDAD/GASTOS/1TR2026/SUMINISTROS/INV337023537.pdf</w:t>
-              <w:br/>
-              <w:t xml:space="preserve">  Evidencia (automatico, 78%): 08_JUSTIFICACION_ECONOMICA/CONTABILIDAD/GASTOS/1TR2026/SUMINISTROS/INV345039957_A23333533_03092026.pdf</w:t>
-              <w:br/>
-              <w:t xml:space="preserve">  Evidencia (automatico, 78%): 08_JUSTIFICACION_ECONOMICA/CONTABILIDAD/GASTOS/1TR2026/SUMINISTROS/Factura_FMPVAAJ001XXXX.pdf</w:t>
-              <w:br/>
-              <w:t xml:space="preserve">  Evidencia (automatico, 78%): 08_JUSTIFICACION_ECONOMICA/CONTABILIDAD/GASTOS/1TR2026/SUMINISTROS/factura monitor.pdf</w:t>
-              <w:br/>
-              <w:t xml:space="preserve">  Evidencia (automatico, 78%): 08_JUSTIFICACION_ECONOMICA/CONTABILIDAD/GASTOS/1TR2026/SUMINISTROS/INV341096775.pdf</w:t>
-              <w:br/>
-              <w:t xml:space="preserve">  Evidencia (automatico, 78%): 08_JUSTIFICACION_ECONOMICA/CONTABILIDAD/GASTOS/1TR2026/SUMINISTROS/Factura_FMPVACJ007XXXX.pdf</w:t>
-              <w:br/>
-              <w:t xml:space="preserve">  Evidencia (automatico, 78%): 08_JUSTIFICACION_ECONOMICA/CONTABILIDAD/GASTOS/1TR2026/SUMINISTROS/Factura_FMPVABJ005XXXX.pdf</w:t>
-              <w:br/>
-              <w:t xml:space="preserve">  Evidencia (automatico, 78%): 08_JUSTIFICACION_ECONOMICA/CONTABILIDAD/GASTOS/1TR2026/SUMINISTROS/Factura_MMPVACJ002XXXX.pdf</w:t>
-              <w:br/>
-              <w:t xml:space="preserve">  Evidencia (automatico, 78%): 08_JUSTIFICACION_ECONOMICA/CONTABILIDAD/GASTOS/1TR2026/SUMINISTROS/INV341096775_A23333533_02092026.pdf</w:t>
-              <w:br/>
-              <w:t xml:space="preserve">  Evidencia (automatico, 78%): 08_JUSTIFICACION_ECONOMICA/CONTABILIDAD/GASTOS/2TR2026/MKT/03_Zeena_MKT_engira.pdf</w:t>
-              <w:br/>
-              <w:t xml:space="preserve">  Evidencia (automatico, 78%): 08_JUSTIFICACION_ECONOMICA/CONTABILIDAD/GASTOS/2TR2026/MKT/04_Zeena_MKT_enGira.pdf</w:t>
-              <w:br/>
-              <w:t xml:space="preserve">  Evidencia (automatico, 78%): 08_JUSTIFICACION_ECONOMICA/CONTABILIDAD/GASTOS/2TR2026/DATA/02_Zeena_Data_enGira.pdf</w:t>
-              <w:br/>
-              <w:t xml:space="preserve">  Evidencia (automatico, 78%): 08_JUSTIFICACION_ECONOMICA/CONTABILIDAD/GASTOS/3TR2025/MANTENIMIENTO TÉCNICO/Factura_202507_01.pdf</w:t>
-              <w:br/>
-              <w:t xml:space="preserve">  Evidencia (automatico, 78%): 08_JUSTIFICACION_ECONOMICA/CONTABILIDAD/GASTOS/3TR2025/SEGURIDAD SOCIAL/CUOTA JULIO.png</w:t>
-              <w:br/>
-              <w:t xml:space="preserve">  Evidencia (automatico, 78%): 08_JUSTIFICACION_ECONOMICA/CONTABILIDAD/GASTOS/3TR2025/SEGURIDAD SOCIAL/CUOTA AGOSTO.png</w:t>
-              <w:br/>
-              <w:t xml:space="preserve">  Evidencia (automatico, 78%): 08_JUSTIFICACION_ECONOMICA/CONTABILIDAD/GASTOS/3TR2025/SEGURIDAD SOCIAL/cos maria moral0925.pdf</w:t>
-              <w:br/>
-              <w:t xml:space="preserve">  Evidencia (automatico, 78%): 08_JUSTIFICACION_ECONOMICA/CONTABILIDAD/GASTOS/3TR2025/SEGURIDAD SOCIAL/CUOTA SEPT.png</w:t>
-              <w:br/>
-              <w:t xml:space="preserve">  Evidencia (automatico, 78%): 08_JUSTIFICACION_ECONOMICA/CONTABILIDAD/GASTOS/3TR2025/SUMINISTROS/FACTURA_MMPVAGI0016002_25-07-2025.pdf</w:t>
-              <w:br/>
-              <w:t xml:space="preserve">  Evidencia (automatico, 78%): 08_JUSTIFICACION_ECONOMICA/CONTABILIDAD/GASTOS/3TR2025/SUMINISTROS/Factura_MMPVAII001XXXX.pdf</w:t>
-              <w:br/>
-              <w:t xml:space="preserve">  Evidencia (automatico, 78%): 08_JUSTIFICACION_ECONOMICA/CONTABILIDAD/GASTOS/3TR2025/SUMINISTROS/Factura_FMPVAII004XXXX.pdf</w:t>
-              <w:br/>
-              <w:t xml:space="preserve">  Evidencia (automatico, 78%): 08_JUSTIFICACION_ECONOMICA/CONTABILIDAD/GASTOS/3TR2025/SUMINISTROS/FACTURA_FMPVAHI0010009_25-08-2025.pdf</w:t>
-              <w:br/>
-              <w:t xml:space="preserve">  Evidencia (automatico, 78%): 08_JUSTIFICACION_ECONOMICA/CONTABILIDAD/GASTOS/3TR2025/SUMINISTROS/FACTURA_FMPVAGI0013315_25-07-2025.pdf</w:t>
-              <w:br/>
-              <w:t xml:space="preserve">  Evidencia (automatico, 78%): 08_JUSTIFICACION_ECONOMICA/CONTABILIDAD/GASTOS/3TR2025/SUMINISTROS/FACTURA_MMPVAHI0004037_25-08-2025.pdf</w:t>
-              <w:br/>
-              <w:t xml:space="preserve">  Evidencia (automatico, 78%): 08_JUSTIFICACION_ECONOMICA/CONTABILIDAD/GASTOS/3TR2025/DIETAS/FACTURA CUANDO SALI DE CUBA MESA 19-25.pdf</w:t>
-              <w:br/>
-              <w:t xml:space="preserve">  Evidencia (automatico, 78%): 08_JUSTIFICACION_ECONOMICA/CONTABILIDAD/GASTOS/3TR2025/COMERCIALIZACIÓN/NÓMINAS/NOM_CARLES_HARILLO.pdf</w:t>
-              <w:br/>
-              <w:t xml:space="preserve">  Evidencia (automatico, 78%): 08_JUSTIFICACION_ECONOMICA/CONTABILIDAD/GASTOS/3TR2025/COMERCIALIZACIÓN/MERCARTES/PRODUCCIÓN/factura pie de tv.pdf</w:t>
-              <w:br/>
-              <w:t xml:space="preserve">  Evidencia (automatico, 78%): 08_JUSTIFICACION_ECONOMICA/CONTABILIDAD/GASTOS/3TR2025/COMERCIALIZACIÓN/MERCARTES/PRODUCCIÓN/Factura pccomponentes TV.pdf</w:t>
-              <w:br/>
-              <w:t xml:space="preserve">  Evidencia (automatico, 78%): 08_JUSTIFICACION_ECONOMICA/CONTABILIDAD/GASTOS/3TR2025/COMERCIALIZACIÓN/MERCARTES/PRODUCCIÓN/Factura No. 2025 E 000629 - enGira.pdf</w:t>
-              <w:br/>
-              <w:t xml:space="preserve">  Evidencia (automatico, 78%): 08_JUSTIFICACION_ECONOMICA/CONTABILIDAD/GASTOS/3TR2025/COMERCIALIZACIÓN/MERCARTES/TRANSPORTE/VJLVK4WVZN6U2846.pdf</w:t>
-              <w:br/>
-              <w:t xml:space="preserve">  Evidencia (automatico, 78%): 08_JUSTIFICACION_ECONOMICA/CONTABILIDAD/GASTOS/3TR2025/COMERCIALIZACIÓN/MERCARTES/DIETAS/Factura_Mercartes_2025_C752426 (1).pdf</w:t>
-              <w:br/>
-              <w:t xml:space="preserve">  Evidencia (automatico, 78%): 08_JUSTIFICACION_ECONOMICA/CONTABILIDAD/GASTOS/3TR2025/COMERCIALIZACIÓN/MERCARTES/DIETAS/Factura_Mercartes_2025_C752426 (2).pdf</w:t>
-              <w:br/>
-              <w:t xml:space="preserve">  Evidencia (automatico, 78%): 08_JUSTIFICACION_ECONOMICA/CONTABILIDAD/GASTOS/3TR2025/COMERCIALIZACIÓN/MERCARTES/DIETAS/Factura_Mercartes_2025_C752426 (5).pdf</w:t>
-              <w:br/>
-              <w:t xml:space="preserve">  Evidencia (automatico, 78%): 08_JUSTIFICACION_ECONOMICA/CONTABILIDAD/GASTOS/4TR2025/FORMACION/Factura_202512_02.pdf</w:t>
-              <w:br/>
-              <w:t xml:space="preserve">  Evidencia (automatico, 78%): 08_JUSTIFICACION_ECONOMICA/CONTABILIDAD/GASTOS/4TR2025/MANTENIMIENTO TÉCNICO/Factura_202512_02.pdf</w:t>
-              <w:br/>
-              <w:t xml:space="preserve">  Evidencia (automatico, 78%): 08_JUSTIFICACION_ECONOMICA/CONTABILIDAD/GASTOS/4TR2025/NOMINAS/finiq. darlene 241125.pdf</w:t>
-              <w:br/>
-              <w:t xml:space="preserve">  Evidencia (automatico, 78%): 08_JUSTIFICACION_ECONOMICA/CONTABILIDAD/GASTOS/4TR2025/NOMINAS/finiq. maria jose 311025.pdf</w:t>
-              <w:br/>
-              <w:t xml:space="preserve">  Evidencia (automatico, 78%): 08_JUSTIFICACION_ECONOMICA/CONTABILIDAD/GASTOS/4TR2025/NOMINAS/cos maria moral09-1025.pdf</w:t>
-              <w:br/>
-              <w:t xml:space="preserve">  Evidencia (automatico, 78%): 08_JUSTIFICACION_ECONOMICA/CONTABILIDAD/GASTOS/4TR2025/PROGRAMA ACOMPAÑAMIENTO/1_enGira_programa_acompañamiento.pdf</w:t>
-              <w:br/>
-              <w:t xml:space="preserve">  Evidencia (automatico, 78%): 08_JUSTIFICACION_ECONOMICA/CONTABILIDAD/GASTOS/4TR2025/TRANSPORTE/VJTLVPX73H4Y7930.pdf</w:t>
-              <w:br/>
-              <w:t xml:space="preserve">  Evidencia (automatico, 78%): 08_JUSTIFICACION_ECONOMICA/CONTABILIDAD/GASTOS/4TR2025/TRANSPORTE/parking reunikn ministerio.pdf</w:t>
-              <w:br/>
-              <w:t xml:space="preserve">  Evidencia (automatico, 78%): 08_JUSTIFICACION_ECONOMICA/CONTABILIDAD/GASTOS/4TR2025/TRANSPORTE/VJ5GPLTFTKM50244.pdf</w:t>
-              <w:br/>
-              <w:t xml:space="preserve">  Evidencia (automatico, 78%): 08_JUSTIFICACION_ECONOMICA/CONTABILIDAD/GASTOS/4TR2025/TRANSPORTE/VJXCFZZJ3WNC7931.pdf</w:t>
-              <w:br/>
-              <w:t xml:space="preserve">  Evidencia (automatico, 78%): 08_JUSTIFICACION_ECONOMICA/CONTABILIDAD/GASTOS/4TR2025/TRANSPORTE/parking mercartes.pdf</w:t>
-              <w:br/>
-              <w:t xml:space="preserve">  Evidencia (automatico, 78%): 08_JUSTIFICACION_ECONOMICA/CONTABILIDAD/GASTOS/4TR2025/TRANSPORTE/peajes mercartes.pdf</w:t>
-              <w:br/>
-              <w:t xml:space="preserve">  Evidencia (automatico, 78%): 08_JUSTIFICACION_ECONOMICA/CONTABILIDAD/GASTOS/4TR2025/SUMINISTROS/Factura_FMPVALI001XXXX.pdf</w:t>
-              <w:br/>
-              <w:t xml:space="preserve">  Evidencia (automatico, 78%): 08_JUSTIFICACION_ECONOMICA/CONTABILIDAD/GASTOS/4TR2025/SUMINISTROS/SN_3291000012688128.pdf</w:t>
-              <w:br/>
-              <w:t xml:space="preserve">  Evidencia (automatico, 78%): 08_JUSTIFICACION_ECONOMICA/CONTABILIDAD/GASTOS/4TR2025/SUMINISTROS/Factura_MMPVAJI002XXXX.pdf</w:t>
-              <w:br/>
-              <w:t xml:space="preserve">  Evidencia (automatico, 78%): 08_JUSTIFICACION_ECONOMICA/CONTABILIDAD/GASTOS/4TR2025/SUMINISTROS/Factura_MMPVALI001XXXX.pdf</w:t>
-              <w:br/>
-              <w:t xml:space="preserve">  Evidencia (automatico, 78%): 08_JUSTIFICACION_ECONOMICA/CONTABILIDAD/GASTOS/4TR2025/SUMINISTROS/invoice.pdf</w:t>
-              <w:br/>
-              <w:t xml:space="preserve">  Evidencia (automatico, 78%): 08_JUSTIFICACION_ECONOMICA/CONTABILIDAD/GASTOS/4TR2025/SUMINISTROS/Invoice-SIB-4109801.pdf</w:t>
-              <w:br/>
-              <w:t xml:space="preserve">  Evidencia (automatico, 78%): 08_JUSTIFICACION_ECONOMICA/CONTABILIDAD/GASTOS/4TR2025/SUMINISTROS/Factura_FMPVAJI006XXXX.pdf</w:t>
-              <w:br/>
-              <w:t xml:space="preserve">  Evidencia (automatico, 78%): 08_JUSTIFICACION_ECONOMICA/CONTABILIDAD/GASTOS/4TR2025/SUMINISTROS/Factura_MMPVAKI001XXXX.pdf</w:t>
-              <w:br/>
-              <w:t xml:space="preserve">  Evidencia (automatico, 78%): 08_JUSTIFICACION_ECONOMICA/CONTABILIDAD/GASTOS/4TR2025/SUMINISTROS/Factura_FMPVAKI003XXXX.pdf</w:t>
-              <w:br/>
-              <w:t xml:space="preserve">  Evidencia (automatico, 78%): 08_JUSTIFICACION_ECONOMICA/CONTABILIDAD/GASTOS/4TR2025/SUMINISTROS/INV328281907.pdf</w:t>
-              <w:br/>
-              <w:t xml:space="preserve">  Evidencia (automatico, 78%): 08_JUSTIFICACION_ECONOMICA/CONTABILIDAD/GASTOS/4TR2025/COMERCIALIZACIÓN/Invoice_2025_0054_Big_Bang_TA25.pdf</w:t>
-              <w:br/>
-              <w:t xml:space="preserve">  Evidencia (automatico, 78%): 08_JUSTIFICACION_ECONOMICA/CONTABILIDAD/GASTOS/4TR2025/COMERCIALIZACIÓN/Invoice_2025_0055_Big_Bang_TA25.pdf</w:t>
-              <w:br/>
-              <w:t xml:space="preserve">  Evidencia (automatico, 78%): 08_JUSTIFICACION_ECONOMICA/CONTABILIDAD/GASTOS/4TR2025/COMERCIALIZACIÓN/Captura de pantalla 2025-11-25 a las 11.29.12.png</w:t>
-              <w:br/>
-              <w:t xml:space="preserve">  Evidencia (automatico, 78%): 08_JUSTIFICACION_ECONOMICA/CONTABILIDAD/GASTOS/4TR2025/DIETAS/BDC-6790184301-invoice-2847.pdf</w:t>
-              <w:br/>
-              <w:t xml:space="preserve">  Evidencia (automatico, 78%): 08_JUSTIFICACION_ECONOMICA/CONTABILIDAD/GASTOS/4TR2025/DIETAS/Adobe Scan 21 oct 2025.pdf</w:t>
-              <w:br/>
-              <w:t xml:space="preserve">  Evidencia (automatico, 78%): 08_JUSTIFICACION_ECONOMICA/CONTABILIDAD/GASTOS/4TR2025/DIETAS/factura 10a.pdf</w:t>
-              <w:br/>
-              <w:t xml:space="preserve">  Evidencia (automatico, 78%): 08_JUSTIFICACION_ECONOMICA/CONTABILIDAD/GASTOS/4TR2025/DIETAS/Adobe Scan 23 oct 2025.pdf</w:t>
-              <w:br/>
-              <w:t xml:space="preserve">  Evidencia (automatico, 78%): 08_JUSTIFICACION_ECONOMICA/CONTABILIDAD/GASTOS/4TR2025/DIETAS/Adobe Scan 24 oct 2025.pdf</w:t>
-              <w:br/>
-              <w:t xml:space="preserve">  Evidencia (automatico, 78%): 08_JUSTIFICACION_ECONOMICA/CONTABILIDAD/GASTOS/4TR2025/DIETAS/Adobe Scan 24 oct 2025 (1).pdf</w:t>
-              <w:br/>
-              <w:t xml:space="preserve">  Evidencia (automatico, 78%): 08_JUSTIFICACION_ECONOMICA/CONTABILIDAD/GASTOS/4TR2025/DIETAS/BPBLO_invoice_TB2504602_20251122_235002.pdf</w:t>
-              <w:br/>
-              <w:t xml:space="preserve">  Evidencia (automatico, 78%): 08_JUSTIFICACION_ECONOMICA/CONTABILIDAD/GASTOS/4TR2025/DIETAS/dietas 2.pdf</w:t>
-              <w:br/>
-              <w:t xml:space="preserve">  Evidencia (automatico, 78%): 08_JUSTIFICACION_ECONOMICA/CONTABILIDAD/GASTOS/4TR2025/LEGAL/FACTURA 25032622R.pdf</w:t>
-              <w:br/>
-              <w:t xml:space="preserve">  Evidencia (automatico, 78%): 08_JUSTIFICACION_ECONOMICA/CONTABILIDAD/GASTOS/4TR2025/LEGAL/FACTURA 25005841RSPD.pdf</w:t>
-              <w:br/>
-              <w:t xml:space="preserve">  Evidencia (automatico, 78%): 08_JUSTIFICACION_ECONOMICA/CONTABILIDAD/GASTOS/4TR2025/COMERCIALIZACIÓN/MERCARTES/20251020_100640.jpg</w:t>
-              <w:br/>
-              <w:t xml:space="preserve">  Evidencia (automatico, 78%): 08_JUSTIFICACION_ECONOMICA/CONTABILIDAD/GASTOS/4TR2025/COMERCIALIZACIÓN/MERCARTES/Adobe Scan 20 oct 2025 (1).pdf</w:t>
-              <w:br/>
-              <w:t xml:space="preserve">  Evidencia (automatico, 78%): 08_JUSTIFICACION_ECONOMICA/CONTABILIDAD/GASTOS/4TR2025/COMERCIALIZACIÓN/MERCARTES/FACTURA María José Moral Morgado octubre 2025.pdf</w:t>
-              <w:br/>
-              <w:t xml:space="preserve">  Evidencia (automatico, 78%): 08_JUSTIFICACION_ECONOMICA/CONTABILIDAD/GASTOS/4TR2025/COMERCIALIZACIÓN/MERCARTES/A-V2025-5238950.pdf</w:t>
-              <w:br/>
-              <w:t xml:space="preserve">  Evidencia (automatico, 78%): 08_JUSTIFICACION_ECONOMICA/CONTABILIDAD/GASTOS/4TR2025/SUMINISTROS/GASOLINA/Adobe Scan 20 oct 2025.pdf</w:t>
+              <w:t xml:space="preserve">  Evidencia (automatico, 78%): 08_JUSTIFICACION_ECONOMICA/CONTABILIDAD/JUSTIFICANTES DE PAGO/Justificante F2026_04_zeena.pdf</w:t>
+              <w:br/>
+              <w:t xml:space="preserve">  Evidencia (automatico, 78%): 08_JUSTIFICACION_ECONOMICA/CONTABILIDAD/JUSTIFICANTES DE PAGO/Justificante_paloma calle.pdf</w:t>
+              <w:br/>
+              <w:t xml:space="preserve">  Evidencia (automatico, 78%): 08_JUSTIFICACION_ECONOMICA/CONTABILIDAD/JUSTIFICANTES DE PAGO/porfinlunes_dossier.pdf</w:t>
+              <w:br/>
+              <w:t xml:space="preserve">  Evidencia (automatico, 78%): 08_JUSTIFICACION_ECONOMICA/CONTABILIDAD/JUSTIFICANTES DE PAGO/Justificante_operacion_291220250084483.pdf</w:t>
+              <w:br/>
+              <w:t xml:space="preserve">  Evidencia (automatico, 78%): 08_JUSTIFICACION_ECONOMICA/CONTABILIDAD/JUSTIFICANTES DE PAGO/Justificante pago Darlene.pdf</w:t>
+              <w:br/>
+              <w:t xml:space="preserve">  Evidencia (automatico, 78%): 08_JUSTIFICACION_ECONOMICA/CONTABILIDAD/JUSTIFICANTES DE PAGO/justificante_stand_mercartes.pdf</w:t>
+              <w:br/>
+              <w:t xml:space="preserve">  Evidencia (automatico, 78%): 08_JUSTIFICACION_ECONOMICA/CONTABILIDAD/JUSTIFICANTES DE PAGO/Justificante_nómina_carles_septiembre.pdf</w:t>
+              <w:br/>
+              <w:t xml:space="preserve">  Evidencia (automatico, 78%): 08_JUSTIFICACION_ECONOMICA/CONTABILIDAD/JUSTIFICANTES DE PAGO/alvaro_caboalles.pdf</w:t>
+              <w:br/>
+              <w:t xml:space="preserve">  Evidencia (automatico, 78%): 08_JUSTIFICACION_ECONOMICA/CONTABILIDAD/JUSTIFICANTES DE PAGO/Justificante_operacion_211120250104897.pdf</w:t>
+              <w:br/>
+              <w:t xml:space="preserve">  Evidencia (automatico, 78%): 08_JUSTIFICACION_ECONOMICA/CONTABILIDAD/JUSTIFICANTES DE PAGO/Justificante_operacion_031120250065659.pdf</w:t>
+              <w:br/>
+              <w:t xml:space="preserve">  Evidencia (automatico, 78%): 08_JUSTIFICACION_ECONOMICA/CONTABILIDAD/JUSTIFICANTES DE PAGO/72121899-f19f-4963-bce2-a525b5ac25be.pdf</w:t>
+              <w:br/>
+              <w:t xml:space="preserve">  Evidencia (automatico, 78%): 08_JUSTIFICACION_ECONOMICA/CONTABILIDAD/JUSTIFICANTES DE PAGO/Justificante_operacion_151220250002633.pdf</w:t>
+              <w:br/>
+              <w:t xml:space="preserve">  Evidencia (automatico, 78%): 08_JUSTIFICACION_ECONOMICA/CONTABILIDAD/JUSTIFICANTES DE PAGO/MKT 50%.pdf</w:t>
+              <w:br/>
+              <w:t xml:space="preserve">  Evidencia (automatico, 78%): 08_JUSTIFICACION_ECONOMICA/CONTABILIDAD/JUSTIFICANTES DE PAGO/Justificante_operacion_270220260145618.pdf</w:t>
+              <w:br/>
+              <w:t xml:space="preserve">  Evidencia (automatico, 78%): 08_JUSTIFICACION_ECONOMICA/CONTABILIDAD/JUSTIFICANTES DE PAGO/Justificante_operacion_291220250085625.pdf</w:t>
+              <w:br/>
+              <w:t xml:space="preserve">  Evidencia (automatico, 78%): 08_JUSTIFICACION_ECONOMICA/CONTABILIDAD/JUSTIFICANTES DE PAGO/QUOTANDA.pdf</w:t>
+              <w:br/>
+              <w:t xml:space="preserve">  Evidencia (automatico, 78%): 08_JUSTIFICACION_ECONOMICA/CONTABILIDAD/JUSTIFICANTES DE PAGO/Justificante_operacion_161220250060976.pdf</w:t>
+              <w:br/>
+              <w:t xml:space="preserve">  Evidencia (automatico, 78%): 08_JUSTIFICACION_ECONOMICA/CONTABILIDAD/GASTOS/NOMINAS/NOM_CARLES_HARILLO.pdf</w:t>
+              <w:br/>
+              <w:t xml:space="preserve">  Evidencia (automatico, 78%): 08_JUSTIFICACION_ECONOMICA/CONTABILIDAD/GASTOS/NOMINAS/finiq. darlene 241125.pdf</w:t>
+              <w:br/>
+              <w:t xml:space="preserve">  Evidencia (automatico, 78%): 08_JUSTIFICACION_ECONOMICA/CONTABILIDAD/GASTOS/NOMINAS/finiq. maria jose 311025.pdf</w:t>
+              <w:br/>
+              <w:t xml:space="preserve">  Evidencia (automatico, 78%): 08_JUSTIFICACION_ECONOMICA/CONTABILIDAD/GASTOS/NOMINAS/cos maria moral09-1025.pdf</w:t>
+              <w:br/>
+              <w:t xml:space="preserve">  Evidencia (automatico, 78%): 08_JUSTIFICACION_ECONOMICA/CONTABILIDAD/GASTOS/PROVEEDORES EXTERNOS/1TR2026/ALIANZAS /F260009 -Zeena - Dossier EnGira.pdf</w:t>
+              <w:br/>
+              <w:t xml:space="preserve">  Evidencia (automatico, 78%): 08_JUSTIFICACION_ECONOMICA/CONTABILIDAD/GASTOS/PROVEEDORES EXTERNOS/1TR2026/SERVICIO DATA/factura_1_servicio_data.pdf</w:t>
+              <w:br/>
+              <w:t xml:space="preserve">  Evidencia (automatico, 78%): 08_JUSTIFICACION_ECONOMICA/CONTABILIDAD/GASTOS/PROVEEDORES EXTERNOS/1TR2026/SUMINISTROS/INV337023537.pdf</w:t>
+              <w:br/>
+              <w:t xml:space="preserve">  Evidencia (automatico, 78%): 08_JUSTIFICACION_ECONOMICA/CONTABILIDAD/GASTOS/PROVEEDORES EXTERNOS/1TR2026/SUMINISTROS/INV345039957_A23333533_03092026.pdf</w:t>
+              <w:br/>
+              <w:t xml:space="preserve">  Evidencia (automatico, 78%): 08_JUSTIFICACION_ECONOMICA/CONTABILIDAD/GASTOS/PROVEEDORES EXTERNOS/1TR2026/SUMINISTROS/Factura_FMPVAAJ001XXXX.pdf</w:t>
+              <w:br/>
+              <w:t xml:space="preserve">  Evidencia (automatico, 78%): 08_JUSTIFICACION_ECONOMICA/CONTABILIDAD/GASTOS/PROVEEDORES EXTERNOS/1TR2026/SUMINISTROS/factura monitor.pdf</w:t>
+              <w:br/>
+              <w:t xml:space="preserve">  Evidencia (automatico, 78%): 08_JUSTIFICACION_ECONOMICA/CONTABILIDAD/GASTOS/PROVEEDORES EXTERNOS/1TR2026/SUMINISTROS/INV341096775.pdf</w:t>
+              <w:br/>
+              <w:t xml:space="preserve">  Evidencia (automatico, 78%): 08_JUSTIFICACION_ECONOMICA/CONTABILIDAD/GASTOS/PROVEEDORES EXTERNOS/1TR2026/SUMINISTROS/Factura_FMPVACJ007XXXX.pdf</w:t>
+              <w:br/>
+              <w:t xml:space="preserve">  Evidencia (automatico, 78%): 08_JUSTIFICACION_ECONOMICA/CONTABILIDAD/GASTOS/PROVEEDORES EXTERNOS/1TR2026/SUMINISTROS/Factura_FMPVABJ005XXXX.pdf</w:t>
+              <w:br/>
+              <w:t xml:space="preserve">  Evidencia (automatico, 78%): 08_JUSTIFICACION_ECONOMICA/CONTABILIDAD/GASTOS/PROVEEDORES EXTERNOS/1TR2026/SUMINISTROS/Factura_MMPVACJ002XXXX.pdf</w:t>
+              <w:br/>
+              <w:t xml:space="preserve">  Evidencia (automatico, 78%): 08_JUSTIFICACION_ECONOMICA/CONTABILIDAD/GASTOS/PROVEEDORES EXTERNOS/1TR2026/SUMINISTROS/INV341096775_A23333533_02092026.pdf</w:t>
+              <w:br/>
+              <w:t xml:space="preserve">  Evidencia (automatico, 78%): 08_JUSTIFICACION_ECONOMICA/CONTABILIDAD/GASTOS/PROVEEDORES EXTERNOS/2TR2026/MKT/04_Zeena_reporting_enGira.pdf</w:t>
+              <w:br/>
+              <w:t xml:space="preserve">  Evidencia (automatico, 78%): 08_JUSTIFICACION_ECONOMICA/CONTABILIDAD/GASTOS/PROVEEDORES EXTERNOS/2TR2026/MKT/03_Zeena_MKT_engira.pdf</w:t>
+              <w:br/>
+              <w:t xml:space="preserve">  Evidencia (automatico, 78%): 08_JUSTIFICACION_ECONOMICA/CONTABILIDAD/GASTOS/PROVEEDORES EXTERNOS/2TR2026/INVESTIGACION/07_26_ACaboalles_ArticulonGira.pdf</w:t>
+              <w:br/>
+              <w:t xml:space="preserve">  Evidencia (automatico, 78%): 08_JUSTIFICACION_ECONOMICA/CONTABILIDAD/GASTOS/PROVEEDORES EXTERNOS/2TR2026/TELEFONO/FACTURA_FMPVADJ0062265_25-04-2026.pdf</w:t>
+              <w:br/>
+              <w:t xml:space="preserve">  Evidencia (automatico, 78%): 08_JUSTIFICACION_ECONOMICA/CONTABILIDAD/GASTOS/PROVEEDORES EXTERNOS/2TR2026/TELEFONO/Factura_MMPVAEJ001XXXX.pdf</w:t>
+              <w:br/>
+              <w:t xml:space="preserve">  Evidencia (automatico, 78%): 08_JUSTIFICACION_ECONOMICA/CONTABILIDAD/GASTOS/PROVEEDORES EXTERNOS/2TR2026/TELEFONO/Factura_FMPVAEJ003XXXX.pdf</w:t>
+              <w:br/>
+              <w:t xml:space="preserve">  Evidencia (automatico, 78%): 08_JUSTIFICACION_ECONOMICA/CONTABILIDAD/GASTOS/PROVEEDORES EXTERNOS/2TR2026/TELEFONO/FACTURA_MMPVADJ0025146_25-04-2026.pdf</w:t>
+              <w:br/>
+              <w:t xml:space="preserve">  Evidencia (automatico, 78%): 08_JUSTIFICACION_ECONOMICA/CONTABILIDAD/GASTOS/PROVEEDORES EXTERNOS/2TR2026/ZOOM/INV357460022-2.pdf</w:t>
+              <w:br/>
+              <w:t xml:space="preserve">  Evidencia (automatico, 78%): 08_JUSTIFICACION_ECONOMICA/CONTABILIDAD/GASTOS/PROVEEDORES EXTERNOS/2TR2026/ZOOM/INV349200211_A23333533_04092026.pdf</w:t>
+              <w:br/>
+              <w:t xml:space="preserve">  Evidencia (automatico, 78%): 08_JUSTIFICACION_ECONOMICA/CONTABILIDAD/GASTOS/PROVEEDORES EXTERNOS/2TR2026/ZOOM/INV353435789-2.pdf</w:t>
+              <w:br/>
+              <w:t xml:space="preserve">  Evidencia (automatico, 78%): 08_JUSTIFICACION_ECONOMICA/CONTABILIDAD/GASTOS/PROVEEDORES EXTERNOS/2TR2026/SERVIDOR/Factura_2026-06-25_202786711054_V99933615.pdf</w:t>
+              <w:br/>
+              <w:t xml:space="preserve">  Evidencia (automatico, 78%): 08_JUSTIFICACION_ECONOMICA/CONTABILIDAD/GASTOS/PROVEEDORES EXTERNOS/2TR2026/SERVIDOR/Factura_2026-05-25_202786492020_V99933615.pdf</w:t>
+              <w:br/>
+              <w:t xml:space="preserve">  Evidencia (automatico, 78%): 08_JUSTIFICACION_ECONOMICA/CONTABILIDAD/GASTOS/PROVEEDORES EXTERNOS/2TR2026/DATA/02_Zeena_Data_enGira.pdf</w:t>
+              <w:br/>
+              <w:t xml:space="preserve">  Evidencia (automatico, 78%): 08_JUSTIFICACION_ECONOMICA/CONTABILIDAD/GASTOS/PROVEEDORES EXTERNOS/3TR2025/MANTENIMIENTO TÉCNICO/Factura_202507_01.pdf</w:t>
+              <w:br/>
+              <w:t xml:space="preserve">  Evidencia (automatico, 78%): 08_JUSTIFICACION_ECONOMICA/CONTABILIDAD/GASTOS/PROVEEDORES EXTERNOS/3TR2025/SEGURIDAD SOCIAL/CUOTA JULIO.png</w:t>
+              <w:br/>
+              <w:t xml:space="preserve">  Evidencia (automatico, 78%): 08_JUSTIFICACION_ECONOMICA/CONTABILIDAD/GASTOS/PROVEEDORES EXTERNOS/3TR2025/SEGURIDAD SOCIAL/CUOTA AGOSTO.png</w:t>
+              <w:br/>
+              <w:t xml:space="preserve">  Evidencia (automatico, 78%): 08_JUSTIFICACION_ECONOMICA/CONTABILIDAD/GASTOS/PROVEEDORES EXTERNOS/3TR2025/SEGURIDAD SOCIAL/cos maria moral0925.pdf</w:t>
+              <w:br/>
+              <w:t xml:space="preserve">  Evidencia (automatico, 78%): 08_JUSTIFICACION_ECONOMICA/CONTABILIDAD/GASTOS/PROVEEDORES EXTERNOS/3TR2025/SEGURIDAD SOCIAL/CUOTA SEPT.png</w:t>
+              <w:br/>
+              <w:t xml:space="preserve">  Evidencia (automatico, 78%): 08_JUSTIFICACION_ECONOMICA/CONTABILIDAD/GASTOS/PROVEEDORES EXTERNOS/3TR2025/SUMINISTROS/FACTURA_MMPVAGI0016002_25-07-2025.pdf</w:t>
+              <w:br/>
+              <w:t xml:space="preserve">  Evidencia (automatico, 78%): 08_JUSTIFICACION_ECONOMICA/CONTABILIDAD/GASTOS/PROVEEDORES EXTERNOS/3TR2025/SUMINISTROS/Factura_MMPVAII001XXXX.pdf</w:t>
+              <w:br/>
+              <w:t xml:space="preserve">  Evidencia (automatico, 78%): 08_JUSTIFICACION_ECONOMICA/CONTABILIDAD/GASTOS/PROVEEDORES EXTERNOS/3TR2025/SUMINISTROS/Factura_FMPVAII004XXXX.pdf</w:t>
+              <w:br/>
+              <w:t xml:space="preserve">  Evidencia (automatico, 78%): 08_JUSTIFICACION_ECONOMICA/CONTABILIDAD/GASTOS/PROVEEDORES EXTERNOS/3TR2025/SUMINISTROS/FACTURA_FMPVAHI0010009_25-08-2025.pdf</w:t>
+              <w:br/>
+              <w:t xml:space="preserve">  Evidencia (automatico, 78%): 08_JUSTIFICACION_ECONOMICA/CONTABILIDAD/GASTOS/PROVEEDORES EXTERNOS/3TR2025/SUMINISTROS/FACTURA_FMPVAGI0013315_25-07-2025.pdf</w:t>
+              <w:br/>
+              <w:t xml:space="preserve">  Evidencia (automatico, 78%): 08_JUSTIFICACION_ECONOMICA/CONTABILIDAD/GASTOS/PROVEEDORES EXTERNOS/3TR2025/SUMINISTROS/FACTURA_MMPVAHI0004037_25-08-2025.pdf</w:t>
+              <w:br/>
+              <w:t xml:space="preserve">  Evidencia (automatico, 78%): 08_JUSTIFICACION_ECONOMICA/CONTABILIDAD/GASTOS/PROVEEDORES EXTERNOS/3TR2025/DIETAS/FACTURA CUANDO SALI DE CUBA MESA 19-25.pdf</w:t>
+              <w:br/>
+              <w:t xml:space="preserve">  Evidencia (automatico, 78%): 08_JUSTIFICACION_ECONOMICA/CONTABILIDAD/GASTOS/PROVEEDORES EXTERNOS/3TR2025/COMERCIALIZACIÓN/MERCARTES/PRODUCCIÓN/factura pie de tv.pdf</w:t>
+              <w:br/>
+              <w:t xml:space="preserve">  Evidencia (automatico, 78%): 08_JUSTIFICACION_ECONOMICA/CONTABILIDAD/GASTOS/PROVEEDORES EXTERNOS/3TR2025/COMERCIALIZACIÓN/MERCARTES/PRODUCCIÓN/Factura pccomponentes TV.pdf</w:t>
+              <w:br/>
+              <w:t xml:space="preserve">  Evidencia (automatico, 78%): 08_JUSTIFICACION_ECONOMICA/CONTABILIDAD/GASTOS/PROVEEDORES EXTERNOS/3TR2025/COMERCIALIZACIÓN/MERCARTES/PRODUCCIÓN/Factura No. 2025 E 000629 - enGira.pdf</w:t>
+              <w:br/>
+              <w:t xml:space="preserve">  Evidencia (automatico, 78%): 08_JUSTIFICACION_ECONOMICA/CONTABILIDAD/GASTOS/PROVEEDORES EXTERNOS/3TR2025/COMERCIALIZACIÓN/MERCARTES/TRANSPORTE/VJLVK4WVZN6U2846.pdf</w:t>
+              <w:br/>
+              <w:t xml:space="preserve">  Evidencia (automatico, 78%): 08_JUSTIFICACION_ECONOMICA/CONTABILIDAD/GASTOS/PROVEEDORES EXTERNOS/3TR2025/COMERCIALIZACIÓN/MERCARTES/DIETAS/Factura_Mercartes_2025_C752426 (1).pdf</w:t>
+              <w:br/>
+              <w:t xml:space="preserve">  Evidencia (automatico, 78%): 08_JUSTIFICACION_ECONOMICA/CONTABILIDAD/GASTOS/PROVEEDORES EXTERNOS/3TR2025/COMERCIALIZACIÓN/MERCARTES/DIETAS/Factura_Mercartes_2025_C752426 (2).pdf</w:t>
+              <w:br/>
+              <w:t xml:space="preserve">  Evidencia (automatico, 78%): 08_JUSTIFICACION_ECONOMICA/CONTABILIDAD/GASTOS/PROVEEDORES EXTERNOS/3TR2025/COMERCIALIZACIÓN/MERCARTES/DIETAS/Factura_Mercartes_2025_C752426 (5).pdf</w:t>
+              <w:br/>
+              <w:t xml:space="preserve">  Evidencia (automatico, 78%): 08_JUSTIFICACION_ECONOMICA/CONTABILIDAD/GASTOS/PROVEEDORES EXTERNOS/4TR2025/FORMACION/Factura_202512_02.pdf</w:t>
+              <w:br/>
+              <w:t xml:space="preserve">  Evidencia (automatico, 78%): 08_JUSTIFICACION_ECONOMICA/CONTABILIDAD/GASTOS/PROVEEDORES EXTERNOS/4TR2025/MANTENIMIENTO TÉCNICO/Factura_202512_02.pdf</w:t>
+              <w:br/>
+              <w:t xml:space="preserve">  Evidencia (automatico, 78%): 08_JUSTIFICACION_ECONOMICA/CONTABILIDAD/GASTOS/PROVEEDORES EXTERNOS/4TR2025/PROGRAMA ACOMPAÑAMIENTO/1_enGira_programa_acompañamiento.pdf</w:t>
+              <w:br/>
+              <w:t xml:space="preserve">  Evidencia (automatico, 78%): 08_JUSTIFICACION_ECONOMICA/CONTABILIDAD/GASTOS/PROVEEDORES EXTERNOS/4TR2025/TRANSPORTE/VJTLVPX73H4Y7930.pdf</w:t>
+              <w:br/>
+              <w:t xml:space="preserve">  Evidencia (automatico, 78%): 08_JUSTIFICACION_ECONOMICA/CONTABILIDAD/GASTOS/PROVEEDORES EXTERNOS/4TR2025/TRANSPORTE/parking reunikn ministerio.pdf</w:t>
+              <w:br/>
+              <w:t xml:space="preserve">  Evidencia (automatico, 78%): 08_JUSTIFICACION_ECONOMICA/CONTABILIDAD/GASTOS/PROVEEDORES EXTERNOS/4TR2025/TRANSPORTE/VJ5GPLTFTKM50244.pdf</w:t>
+              <w:br/>
+              <w:t xml:space="preserve">  Evidencia (automatico, 78%): 08_JUSTIFICACION_ECONOMICA/CONTABILIDAD/GASTOS/PROVEEDORES EXTERNOS/4TR2025/TRANSPORTE/VJXCFZZJ3WNC7931.pdf</w:t>
+              <w:br/>
+              <w:t xml:space="preserve">  Evidencia (automatico, 78%): 08_JUSTIFICACION_ECONOMICA/CONTABILIDAD/GASTOS/PROVEEDORES EXTERNOS/4TR2025/TRANSPORTE/parking mercartes.pdf</w:t>
+              <w:br/>
+              <w:t xml:space="preserve">  Evidencia (automatico, 78%): 08_JUSTIFICACION_ECONOMICA/CONTABILIDAD/GASTOS/PROVEEDORES EXTERNOS/4TR2025/TRANSPORTE/peajes mercartes.pdf</w:t>
+              <w:br/>
+              <w:t xml:space="preserve">  Evidencia (automatico, 78%): 08_JUSTIFICACION_ECONOMICA/CONTABILIDAD/GASTOS/PROVEEDORES EXTERNOS/4TR2025/SUMINISTROS/Factura_FMPVALI001XXXX.pdf</w:t>
+              <w:br/>
+              <w:t xml:space="preserve">  Evidencia (automatico, 78%): 08_JUSTIFICACION_ECONOMICA/CONTABILIDAD/GASTOS/PROVEEDORES EXTERNOS/4TR2025/SUMINISTROS/SN_3291000012688128.pdf</w:t>
+              <w:br/>
+              <w:t xml:space="preserve">  Evidencia (automatico, 78%): 08_JUSTIFICACION_ECONOMICA/CONTABILIDAD/GASTOS/PROVEEDORES EXTERNOS/4TR2025/SUMINISTROS/Factura_MMPVAJI002XXXX.pdf</w:t>
+              <w:br/>
+              <w:t xml:space="preserve">  Evidencia (automatico, 78%): 08_JUSTIFICACION_ECONOMICA/CONTABILIDAD/GASTOS/PROVEEDORES EXTERNOS/4TR2025/SUMINISTROS/Factura_MMPVALI001XXXX.pdf</w:t>
+              <w:br/>
+              <w:t xml:space="preserve">  Evidencia (automatico, 78%): 08_JUSTIFICACION_ECONOMICA/CONTABILIDAD/GASTOS/PROVEEDORES EXTERNOS/4TR2025/SUMINISTROS/invoice.pdf</w:t>
+              <w:br/>
+              <w:t xml:space="preserve">  Evidencia (automatico, 78%): 08_JUSTIFICACION_ECONOMICA/CONTABILIDAD/GASTOS/PROVEEDORES EXTERNOS/4TR2025/SUMINISTROS/Invoice-SIB-4109801.pdf</w:t>
+              <w:br/>
+              <w:t xml:space="preserve">  Evidencia (automatico, 78%): 08_JUSTIFICACION_ECONOMICA/CONTABILIDAD/GASTOS/PROVEEDORES EXTERNOS/4TR2025/SUMINISTROS/Factura_FMPVAJI006XXXX.pdf</w:t>
+              <w:br/>
+              <w:t xml:space="preserve">  Evidencia (automatico, 78%): 08_JUSTIFICACION_ECONOMICA/CONTABILIDAD/GASTOS/PROVEEDORES EXTERNOS/4TR2025/SUMINISTROS/Factura_MMPVAKI001XXXX.pdf</w:t>
+              <w:br/>
+              <w:t xml:space="preserve">  Evidencia (automatico, 78%): 08_JUSTIFICACION_ECONOMICA/CONTABILIDAD/GASTOS/PROVEEDORES EXTERNOS/4TR2025/SUMINISTROS/Factura_FMPVAKI003XXXX.pdf</w:t>
+              <w:br/>
+              <w:t xml:space="preserve">  Evidencia (automatico, 78%): 08_JUSTIFICACION_ECONOMICA/CONTABILIDAD/GASTOS/PROVEEDORES EXTERNOS/4TR2025/SUMINISTROS/INV328281907.pdf</w:t>
+              <w:br/>
+              <w:t xml:space="preserve">  Evidencia (automatico, 78%): 08_JUSTIFICACION_ECONOMICA/CONTABILIDAD/GASTOS/PROVEEDORES EXTERNOS/4TR2025/COMERCIALIZACIÓN/Invoice_2025_0054_Big_Bang_TA25.pdf</w:t>
+              <w:br/>
+              <w:t xml:space="preserve">  Evidencia (automatico, 78%): 08_JUSTIFICACION_ECONOMICA/CONTABILIDAD/GASTOS/PROVEEDORES EXTERNOS/4TR2025/COMERCIALIZACIÓN/Invoice_2025_0055_Big_Bang_TA25.pdf</w:t>
+              <w:br/>
+              <w:t xml:space="preserve">  Evidencia (automatico, 78%): 08_JUSTIFICACION_ECONOMICA/CONTABILIDAD/GASTOS/PROVEEDORES EXTERNOS/4TR2025/COMERCIALIZACIÓN/Captura de pantalla 2025-11-25 a las 11.29.12.png</w:t>
+              <w:br/>
+              <w:t xml:space="preserve">  Evidencia (automatico, 78%): 08_JUSTIFICACION_ECONOMICA/CONTABILIDAD/GASTOS/PROVEEDORES EXTERNOS/4TR2025/DIETAS/BDC-6790184301-invoice-2847.pdf</w:t>
+              <w:br/>
+              <w:t xml:space="preserve">  Evidencia (automatico, 78%): 08_JUSTIFICACION_ECONOMICA/CONTABILIDAD/GASTOS/PROVEEDORES EXTERNOS/4TR2025/DIETAS/Adobe Scan 21 oct 2025.pdf</w:t>
+              <w:br/>
+              <w:t xml:space="preserve">  Evidencia (automatico, 78%): 08_JUSTIFICACION_ECONOMICA/CONTABILIDAD/GASTOS/PROVEEDORES EXTERNOS/4TR2025/DIETAS/factura 10a.pdf</w:t>
+              <w:br/>
+              <w:t xml:space="preserve">  Evidencia (automatico, 78%): 08_JUSTIFICACION_ECONOMICA/CONTABILIDAD/GASTOS/PROVEEDORES EXTERNOS/4TR2025/DIETAS/Adobe Scan 23 oct 2025.pdf</w:t>
+              <w:br/>
+              <w:t xml:space="preserve">  Evidencia (automatico, 78%): 08_JUSTIFICACION_ECONOMICA/CONTABILIDAD/GASTOS/PROVEEDORES EXTERNOS/4TR2025/DIETAS/Adobe Scan 24 oct 2025.pdf</w:t>
+              <w:br/>
+              <w:t xml:space="preserve">  Evidencia (automatico, 78%): 08_JUSTIFICACION_ECONOMICA/CONTABILIDAD/GASTOS/PROVEEDORES EXTERNOS/4TR2025/DIETAS/Adobe Scan 24 oct 2025 (1).pdf</w:t>
+              <w:br/>
+              <w:t xml:space="preserve">  Evidencia (automatico, 78%): 08_JUSTIFICACION_ECONOMICA/CONTABILIDAD/GASTOS/PROVEEDORES EXTERNOS/4TR2025/DIETAS/BPBLO_invoice_TB2504602_20251122_235002.pdf</w:t>
+              <w:br/>
+              <w:t xml:space="preserve">  Evidencia (automatico, 78%): 08_JUSTIFICACION_ECONOMICA/CONTABILIDAD/GASTOS/PROVEEDORES EXTERNOS/4TR2025/DIETAS/dietas 2.pdf</w:t>
+              <w:br/>
+              <w:t xml:space="preserve">  Evidencia (automatico, 78%): 08_JUSTIFICACION_ECONOMICA/CONTABILIDAD/GASTOS/PROVEEDORES EXTERNOS/4TR2025/LEGAL/FACTURA 25032622R.pdf</w:t>
+              <w:br/>
+              <w:t xml:space="preserve">  Evidencia (automatico, 78%): 08_JUSTIFICACION_ECONOMICA/CONTABILIDAD/GASTOS/PROVEEDORES EXTERNOS/4TR2025/LEGAL/FACTURA 25005841RSPD.pdf</w:t>
+              <w:br/>
+              <w:t xml:space="preserve">  Evidencia (automatico, 78%): 08_JUSTIFICACION_ECONOMICA/CONTABILIDAD/GASTOS/PROVEEDORES EXTERNOS/4TR2025/COMERCIALIZACIÓN/MERCARTES/20251020_100640.jpg</w:t>
+              <w:br/>
+              <w:t xml:space="preserve">  Evidencia (automatico, 78%): 08_JUSTIFICACION_ECONOMICA/CONTABILIDAD/GASTOS/PROVEEDORES EXTERNOS/4TR2025/COMERCIALIZACIÓN/MERCARTES/Adobe Scan 20 oct 2025 (1).pdf</w:t>
+              <w:br/>
+              <w:t xml:space="preserve">  Evidencia (automatico, 78%): 08_JUSTIFICACION_ECONOMICA/CONTABILIDAD/GASTOS/PROVEEDORES EXTERNOS/4TR2025/COMERCIALIZACIÓN/MERCARTES/FACTURA María José Moral Morgado octubre 2025.pdf</w:t>
+              <w:br/>
+              <w:t xml:space="preserve">  Evidencia (automatico, 78%): 08_JUSTIFICACION_ECONOMICA/CONTABILIDAD/GASTOS/PROVEEDORES EXTERNOS/4TR2025/COMERCIALIZACIÓN/MERCARTES/A-V2025-5238950.pdf</w:t>
+              <w:br/>
+              <w:t xml:space="preserve">  Evidencia (automatico, 78%): 08_JUSTIFICACION_ECONOMICA/CONTABILIDAD/GASTOS/PROVEEDORES EXTERNOS/4TR2025/SUMINISTROS/GASOLINA/Adobe Scan 20 oct 2025.pdf</w:t>
               <w:br/>
               <w:t>[ACC-ADMINISTRACION-1FE0EB5C6C] Teléfono / Internet</w:t>
               <w:br/>
               <w:t xml:space="preserve">  Evidencia (pendiente_revision, 39%): 02_ACTIVIDADES_REALIZADAS/PROGRAMAS DE ACOMPAÑAMIENTO/DiArt/comisionprograma.pdf</w:t>
+              <w:br/>
+              <w:t xml:space="preserve">  Evidencia (automatico, 100%): 08_JUSTIFICACION_ECONOMICA/relacion_gastos.xlsx</w:t>
             </w:r>
           </w:p>
         </w:tc>
@@ -3009,7 +3067,7 @@
           </w:tcPr>
           <w:p>
             <w:r>
-              <w:t>191,00 €</w:t>
+              <w:t>4.773.407.653,05 €</w:t>
             </w:r>
           </w:p>
         </w:tc>
@@ -3069,7 +3127,7 @@
               <w:br/>
               <w:t>[ACC-SOPORTE-TECNICO-Y--68F07784A8] Mejora de la eficiencia del panel de admnistrador de la plataforma enGira!</w:t>
               <w:br/>
-              <w:t xml:space="preserve">  Evidencia (pendiente_revision, 32%): 08_JUSTIFICACION_ECONOMICA/JUSTIFICANTES DE PAGO/Justificante_operacion_291220250085625.pdf</w:t>
+              <w:t xml:space="preserve">  Sin evidencia vinculada; requiere revisión.</w:t>
               <w:br/>
               <w:t>[ACC-SOPORTE-TECNICO-Y--31BE5A971A] Sistema para destacar espectáculos de agentes colaboradores</w:t>
               <w:br/>
@@ -3095,23 +3153,25 @@
               <w:br/>
               <w:t xml:space="preserve">  Evidencia (automatico, 84%): 05_PARTICIPANTES_Y_COLABORADORES/servidor/Condiciones particulares - Servidores.pdf</w:t>
               <w:br/>
-              <w:t xml:space="preserve">  Evidencia (automatico, 84%): 08_JUSTIFICACION_ECONOMICA/CONTABILIDAD/GASTOS/1TR2026/SERVIDOR/Factura_2026-03-25_202785955106_V99933615.pdf</w:t>
-              <w:br/>
-              <w:t xml:space="preserve">  Evidencia (automatico, 84%): 08_JUSTIFICACION_ECONOMICA/CONTABILIDAD/GASTOS/1TR2026/SERVIDOR/Factura_2026-02-25_202785665358_V99933615.pdf</w:t>
-              <w:br/>
-              <w:t xml:space="preserve">  Evidencia (automatico, 84%): 08_JUSTIFICACION_ECONOMICA/CONTABILIDAD/GASTOS/1TR2026/SERVIDOR/Factura_2026-01-25_202785368394_V99933615.pdf</w:t>
-              <w:br/>
-              <w:t xml:space="preserve">  Evidencia (automatico, 84%): 08_JUSTIFICACION_ECONOMICA/CONTABILIDAD/GASTOS/3TR2025/SERVIDOR/Factura_2025-07-25_202783634042_V99933615.pdf</w:t>
-              <w:br/>
-              <w:t xml:space="preserve">  Evidencia (automatico, 84%): 08_JUSTIFICACION_ECONOMICA/CONTABILIDAD/GASTOS/3TR2025/SERVIDOR/Factura_2025-09-25_202784197236_V99933615.pdf</w:t>
-              <w:br/>
-              <w:t xml:space="preserve">  Evidencia (automatico, 84%): 08_JUSTIFICACION_ECONOMICA/CONTABILIDAD/GASTOS/3TR2025/SERVIDOR/Factura_2025-08-25_202783913737_V99933615.pdf</w:t>
-              <w:br/>
-              <w:t xml:space="preserve">  Evidencia (automatico, 84%): 08_JUSTIFICACION_ECONOMICA/CONTABILIDAD/GASTOS/4TR2025/SERVIDOR/Factura_2025-10-25_202784490445_V99933615.pdf</w:t>
-              <w:br/>
-              <w:t xml:space="preserve">  Evidencia (automatico, 84%): 08_JUSTIFICACION_ECONOMICA/CONTABILIDAD/GASTOS/4TR2025/SERVIDOR/Factura_2025-12-25_202785076764_V99933615.pdf</w:t>
-              <w:br/>
-              <w:t xml:space="preserve">  Evidencia (automatico, 84%): 08_JUSTIFICACION_ECONOMICA/CONTABILIDAD/GASTOS/4TR2025/SERVIDOR/Factura_2025-11-25_202784784857_V99933615.pdf</w:t>
+              <w:t xml:space="preserve">  Evidencia (automatico, 84%): 08_JUSTIFICACION_ECONOMICA/CONTABILIDAD/GASTOS/PROVEEDORES EXTERNOS/1TR2026/SERVIDOR/Factura_2026-03-25_202785955106_V99933615.pdf</w:t>
+              <w:br/>
+              <w:t xml:space="preserve">  Evidencia (automatico, 84%): 08_JUSTIFICACION_ECONOMICA/CONTABILIDAD/GASTOS/PROVEEDORES EXTERNOS/1TR2026/SERVIDOR/Factura_2026-02-25_202785665358_V99933615.pdf</w:t>
+              <w:br/>
+              <w:t xml:space="preserve">  Evidencia (automatico, 84%): 08_JUSTIFICACION_ECONOMICA/CONTABILIDAD/GASTOS/PROVEEDORES EXTERNOS/1TR2026/SERVIDOR/Factura_2026-01-25_202785368394_V99933615.pdf</w:t>
+              <w:br/>
+              <w:t xml:space="preserve">  Evidencia (automatico, 84%): 08_JUSTIFICACION_ECONOMICA/CONTABILIDAD/GASTOS/PROVEEDORES EXTERNOS/2TR2026/SERVIDOR/Factura_2026-04-25_202786241049_V99933615.pdf</w:t>
+              <w:br/>
+              <w:t xml:space="preserve">  Evidencia (automatico, 84%): 08_JUSTIFICACION_ECONOMICA/CONTABILIDAD/GASTOS/PROVEEDORES EXTERNOS/3TR2025/SERVIDOR/Factura_2025-07-25_202783634042_V99933615.pdf</w:t>
+              <w:br/>
+              <w:t xml:space="preserve">  Evidencia (automatico, 84%): 08_JUSTIFICACION_ECONOMICA/CONTABILIDAD/GASTOS/PROVEEDORES EXTERNOS/3TR2025/SERVIDOR/Factura_2025-09-25_202784197236_V99933615.pdf</w:t>
+              <w:br/>
+              <w:t xml:space="preserve">  Evidencia (automatico, 84%): 08_JUSTIFICACION_ECONOMICA/CONTABILIDAD/GASTOS/PROVEEDORES EXTERNOS/3TR2025/SERVIDOR/Factura_2025-08-25_202783913737_V99933615.pdf</w:t>
+              <w:br/>
+              <w:t xml:space="preserve">  Evidencia (automatico, 84%): 08_JUSTIFICACION_ECONOMICA/CONTABILIDAD/GASTOS/PROVEEDORES EXTERNOS/4TR2025/SERVIDOR/Factura_2025-10-25_202784490445_V99933615.pdf</w:t>
+              <w:br/>
+              <w:t xml:space="preserve">  Evidencia (automatico, 84%): 08_JUSTIFICACION_ECONOMICA/CONTABILIDAD/GASTOS/PROVEEDORES EXTERNOS/4TR2025/SERVIDOR/Factura_2025-12-25_202785076764_V99933615.pdf</w:t>
+              <w:br/>
+              <w:t xml:space="preserve">  Evidencia (automatico, 84%): 08_JUSTIFICACION_ECONOMICA/CONTABILIDAD/GASTOS/PROVEEDORES EXTERNOS/4TR2025/SERVIDOR/Factura_2025-11-25_202784784857_V99933615.pdf</w:t>
             </w:r>
           </w:p>
         </w:tc>
@@ -3128,7 +3188,7 @@
           </w:tcPr>
           <w:p>
             <w:r>
-              <w:t>0,00 € (sin gasto validado)</w:t>
+              <w:t>323,54 €</w:t>
             </w:r>
           </w:p>
         </w:tc>
@@ -3380,8 +3440,6 @@
               <w:br/>
               <w:t xml:space="preserve">  Evidencia (automatico, 78%): 02_ACTIVIDADES_REALIZADAS/PROGRAMAS DE ACOMPAÑAMIENTO/LaPeraDelOlmo/LaPeraDelOlmo_sesion2_programa_acompañamiento.pdf</w:t>
               <w:br/>
-              <w:t xml:space="preserve">  Evidencia (pendiente_revision, 39%): 08_JUSTIFICACION_ECONOMICA/JUSTIFICANTES DE PAGO/72121899-f19f-4963-bce2-a525b5ac25be.pdf</w:t>
-              <w:br/>
               <w:t>[ACC-COMERCIALIZACION-8BC2ED0AC1] Stand en MERCARTES</w:t>
               <w:br/>
               <w:t xml:space="preserve">  Evidencia (automatico, 100%): 02_ACTIVIDADES_REALIZADAS/MEMORIA ACTIVIDADES set_oct 2025.docx</w:t>
@@ -3390,21 +3448,15 @@
               <w:br/>
               <w:t xml:space="preserve">  Evidencia (automatico, 78%): 02_ACTIVIDADES_REALIZADAS/MERCARTES/HOJA DE RUTAmercartes.docx</w:t>
               <w:br/>
-              <w:t xml:space="preserve">  Evidencia (automatico, 78%): 08_JUSTIFICACION_ECONOMICA/JUSTIFICANTES DE PAGO/Justificante_paloma calle.pdf</w:t>
-              <w:br/>
-              <w:t xml:space="preserve">  Evidencia (automatico, 78%): 08_JUSTIFICACION_ECONOMICA/JUSTIFICANTES DE PAGO/justificante_stand_mercartes.pdf</w:t>
-              <w:br/>
-              <w:t xml:space="preserve">  Evidencia (automatico, 100%): 08_JUSTIFICACION_ECONOMICA/CONTABILIDAD/GASTOS/3TR2025/COMERCIALIZACIÓN/MERCARTES/PRODUCCIÓN/Factura STAND ENGIRA!.pdf</w:t>
-              <w:br/>
-              <w:t xml:space="preserve">  Evidencia (automatico, 100%): 08_JUSTIFICACION_ECONOMICA/CONTABILIDAD/GASTOS/4TR2025/COMERCIALIZACIÓN/MERCARTES/factura mercartes.pdf</w:t>
+              <w:t xml:space="preserve">  Evidencia (automatico, 100%): 08_JUSTIFICACION_ECONOMICA/CONTABILIDAD/GASTOS/PROVEEDORES EXTERNOS/3TR2025/COMERCIALIZACIÓN/MERCARTES/PRODUCCIÓN/Factura STAND ENGIRA!.pdf</w:t>
+              <w:br/>
+              <w:t xml:space="preserve">  Evidencia (automatico, 100%): 08_JUSTIFICACION_ECONOMICA/CONTABILIDAD/GASTOS/PROVEEDORES EXTERNOS/4TR2025/COMERCIALIZACIÓN/MERCARTES/factura mercartes.pdf</w:t>
               <w:br/>
               <w:t>[ACC-COMERCIALIZACION-396ABB13E0] Implementación de servicios de pago para artistas</w:t>
               <w:br/>
               <w:t xml:space="preserve">  Evidencia (pendiente_revision, 58%): 05_PARTICIPANTES_Y_COLABORADORES/contrato zeena_signed_signed.pdf</w:t>
               <w:br/>
               <w:t xml:space="preserve">  Evidencia (pendiente_revision, 39%): 06_DESARROLLO_PLATAFORMA/SEO/Implementación - Engina art.docx</w:t>
-              <w:br/>
-              <w:t xml:space="preserve">  Evidencia (pendiente_revision, 39%): 08_JUSTIFICACION_ECONOMICA/JUSTIFICANTES DE PAGO/Justificante_operacion_161220250060976.pdf</w:t>
             </w:r>
           </w:p>
         </w:tc>
@@ -3421,7 +3473,7 @@
           </w:tcPr>
           <w:p>
             <w:r>
-              <w:t>0,00 € (sin gasto validado)</w:t>
+              <w:t>1.342,80 €</w:t>
             </w:r>
           </w:p>
         </w:tc>
@@ -3602,15 +3654,17 @@
               <w:br/>
               <w:t xml:space="preserve">  Evidencia (automatico, 100%): 02_ACTIVIDADES_REALIZADAS/PROGRAMAS DE ACOMPAÑAMIENTO/DiArt/PLANTILLA CACHET H2o sala.xlsx</w:t>
               <w:br/>
-              <w:t xml:space="preserve">  Evidencia (automatico, 100%): 08_JUSTIFICACION_ECONOMICA/JUSTIFICANTES DE PAGO/Justificante_operacion_201220250038589.pdf</w:t>
-              <w:br/>
-              <w:t xml:space="preserve">  Evidencia (automatico, 100%): 08_JUSTIFICACION_ECONOMICA/JUSTIFICANTES DE PAGO/Justificante_operacion_201220250038229.pdf</w:t>
-              <w:br/>
-              <w:t xml:space="preserve">  Evidencia (automatico, 100%): 08_JUSTIFICACION_ECONOMICA/JUSTIFICANTES DE PAGO/gestoria 2sem26.pdf</w:t>
-              <w:br/>
-              <w:t xml:space="preserve">  Evidencia (automatico, 100%): 08_JUSTIFICACION_ECONOMICA/CONTABILIDAD/GASTOS/4TR2025/GESTORIA/2501003 maría j moral morgado.pdf</w:t>
-              <w:br/>
-              <w:t xml:space="preserve">  Evidencia (automatico, 100%): 08_JUSTIFICACION_ECONOMICA/CONTABILIDAD/GASTOS/4TR2025/GESTORIA/2501006 maría j moral morgado.pdf</w:t>
+              <w:t xml:space="preserve">  Evidencia (automatico, 100%): 08_JUSTIFICACION_ECONOMICA/CONTABILIDAD/JUSTIFICANTES DE PAGO/Justificante_operacion_201220250038589.pdf</w:t>
+              <w:br/>
+              <w:t xml:space="preserve">  Evidencia (automatico, 100%): 08_JUSTIFICACION_ECONOMICA/CONTABILIDAD/JUSTIFICANTES DE PAGO/Justificante_operacion_201220250038229.pdf</w:t>
+              <w:br/>
+              <w:t xml:space="preserve">  Evidencia (automatico, 100%): 08_JUSTIFICACION_ECONOMICA/CONTABILIDAD/JUSTIFICANTES DE PAGO/gestoria 2sem26.pdf</w:t>
+              <w:br/>
+              <w:t xml:space="preserve">  Evidencia (automatico, 100%): 08_JUSTIFICACION_ECONOMICA/CONTABILIDAD/GASTOS/PROVEEDORES EXTERNOS/2TR2026/GESTORÍA/2601187 maría j moral morgado.pdf</w:t>
+              <w:br/>
+              <w:t xml:space="preserve">  Evidencia (automatico, 100%): 08_JUSTIFICACION_ECONOMICA/CONTABILIDAD/GASTOS/PROVEEDORES EXTERNOS/4TR2025/GESTORIA/2501003 maría j moral morgado.pdf</w:t>
+              <w:br/>
+              <w:t xml:space="preserve">  Evidencia (automatico, 100%): 08_JUSTIFICACION_ECONOMICA/CONTABILIDAD/GASTOS/PROVEEDORES EXTERNOS/4TR2025/GESTORIA/2501006 maría j moral morgado.pdf</w:t>
               <w:br/>
               <w:t>[ACC-GESTORIA-EEEA1E56B7] PRL</w:t>
               <w:br/>
@@ -3633,7 +3687,7 @@
           </w:tcPr>
           <w:p>
             <w:r>
-              <w:t>0,00 € (sin gasto validado)</w:t>
+              <w:t>1.500,40 €</w:t>
             </w:r>
           </w:p>
         </w:tc>
@@ -3866,7 +3920,7 @@
           </w:tcPr>
           <w:p>
             <w:r>
-              <w:t>191,00 €</w:t>
+              <w:t>4.773.410.819,79 €</w:t>
             </w:r>
           </w:p>
         </w:tc>

</xml_diff>